<commit_message>
Remove all licensing requirements -- plugin is now free
- Deleted activation_commands.py (ActivateFIFShoeKit, DeactivateFIFShoeKit)
- Deleted licensing.py (Cryptolens LicenseManager, Edition enum)
- Stripped license validation, edition detection, and key caching from plugin_main.py
- Removed Cryptolens constants and edition constants from plugin/__init__.py
- Removed all is_licensed checks from 12 command modules
- Removed license gating from podoCAD_panel.py (all buttons always enabled)
- Replaced license info section in options_form.py with simple plugin info
- Updated user manual: licensing chapter now states "free, no license required"
- Rebuilt FIFShoeKit_1.0.rhi (43 files, 168 KB)

https://claude.ai/code/session_01WmKTfeGCbHjhaBjEwhSWte
</commit_message>
<xml_diff>
--- a/3DShoemaker_Rhino8_Python/FIFShoeKit_Rhino8_User_Manual.docx
+++ b/3DShoemaker_Rhino8_Python/FIFShoeKit_Rhino8_User_Manual.docx
@@ -392,7 +392,7 @@
         <w:pStyle w:val="ListBullet"/>
       </w:pPr>
       <w:r>
-        <w:t>Cryptolens license management (Personal, Business, Enterprise editions)</w:t>
+        <w:t>Free to use -- no license required</w:t>
       </w:r>
     </w:p>
     <w:p>
@@ -530,7 +530,7 @@
           </w:tcPr>
           <w:p>
             <w:r>
-              <w:t>Required for license activation and validation</w:t>
+              <w:t>Not required (free plugin, no activation needed)</w:t>
             </w:r>
           </w:p>
         </w:tc>
@@ -691,7 +691,7 @@
           <w:rFonts w:ascii="Consolas" w:hAnsi="Consolas"/>
           <w:sz w:val="18"/>
         </w:rPr>
-        <w:t xml:space="preserve">  Terms.txt                License agreement</w:t>
+        <w:t xml:space="preserve">  Terms.txt                Terms of use</w:t>
       </w:r>
     </w:p>
     <w:p>
@@ -794,220 +794,12 @@
         <w:pStyle w:val="Heading1"/>
       </w:pPr>
       <w:r>
-        <w:t>4. Licensing &amp; Activation</w:t>
-      </w:r>
-    </w:p>
-    <w:p>
-      <w:r>
-        <w:t>Feet in Focus Shoe Kit uses the Cryptolens licensing system. Licenses are available in three editions:</w:t>
-      </w:r>
-    </w:p>
-    <w:tbl>
-      <w:tblPr>
-        <w:tblStyle w:val="LightGrid-Accent1"/>
-        <w:tblW w:type="auto" w:w="0"/>
-        <w:tblLook w:firstColumn="1" w:firstRow="1" w:lastColumn="0" w:lastRow="0" w:noHBand="0" w:noVBand="1" w:val="04A0"/>
-      </w:tblPr>
-      <w:tblGrid>
-        <w:gridCol w:w="3135"/>
-        <w:gridCol w:w="3135"/>
-        <w:gridCol w:w="3135"/>
-      </w:tblGrid>
-      <w:tr>
-        <w:tc>
-          <w:tcPr>
-            <w:tcW w:type="dxa" w:w="3135"/>
-          </w:tcPr>
-          <w:p>
-            <w:r>
-              <w:rPr>
-                <w:b/>
-              </w:rPr>
-              <w:t>Edition</w:t>
-            </w:r>
-          </w:p>
-        </w:tc>
-        <w:tc>
-          <w:tcPr>
-            <w:tcW w:type="dxa" w:w="3135"/>
-          </w:tcPr>
-          <w:p>
-            <w:r>
-              <w:rPr>
-                <w:b/>
-              </w:rPr>
-              <w:t>Usage</w:t>
-            </w:r>
-          </w:p>
-        </w:tc>
-        <w:tc>
-          <w:tcPr>
-            <w:tcW w:type="dxa" w:w="3135"/>
-          </w:tcPr>
-          <w:p>
-            <w:r>
-              <w:rPr>
-                <w:b/>
-              </w:rPr>
-              <w:t>Features</w:t>
-            </w:r>
-          </w:p>
-        </w:tc>
-      </w:tr>
-      <w:tr>
-        <w:tc>
-          <w:tcPr>
-            <w:tcW w:type="dxa" w:w="3135"/>
-          </w:tcPr>
-          <w:p>
-            <w:r>
-              <w:t>Personal</w:t>
-            </w:r>
-          </w:p>
-        </w:tc>
-        <w:tc>
-          <w:tcPr>
-            <w:tcW w:type="dxa" w:w="3135"/>
-          </w:tcPr>
-          <w:p>
-            <w:r>
-              <w:t>Non-commercial use only</w:t>
-            </w:r>
-          </w:p>
-        </w:tc>
-        <w:tc>
-          <w:tcPr>
-            <w:tcW w:type="dxa" w:w="3135"/>
-          </w:tcPr>
-          <w:p>
-            <w:r>
-              <w:t>All design tools, single machine</w:t>
-            </w:r>
-          </w:p>
-        </w:tc>
-      </w:tr>
-      <w:tr>
-        <w:tc>
-          <w:tcPr>
-            <w:tcW w:type="dxa" w:w="3135"/>
-          </w:tcPr>
-          <w:p>
-            <w:r>
-              <w:t>Business</w:t>
-            </w:r>
-          </w:p>
-        </w:tc>
-        <w:tc>
-          <w:tcPr>
-            <w:tcW w:type="dxa" w:w="3135"/>
-          </w:tcPr>
-          <w:p>
-            <w:r>
-              <w:t>Commercial/professional use</w:t>
-            </w:r>
-          </w:p>
-        </w:tc>
-        <w:tc>
-          <w:tcPr>
-            <w:tcW w:type="dxa" w:w="3135"/>
-          </w:tcPr>
-          <w:p>
-            <w:r>
-              <w:t>All design tools, email support, single machine</w:t>
-            </w:r>
-          </w:p>
-        </w:tc>
-      </w:tr>
-      <w:tr>
-        <w:tc>
-          <w:tcPr>
-            <w:tcW w:type="dxa" w:w="3135"/>
-          </w:tcPr>
-          <w:p>
-            <w:r>
-              <w:t>Enterprise</w:t>
-            </w:r>
-          </w:p>
-        </w:tc>
-        <w:tc>
-          <w:tcPr>
-            <w:tcW w:type="dxa" w:w="3135"/>
-          </w:tcPr>
-          <w:p>
-            <w:r>
-              <w:t>Commercial with extended support</w:t>
-            </w:r>
-          </w:p>
-        </w:tc>
-        <w:tc>
-          <w:tcPr>
-            <w:tcW w:type="dxa" w:w="3135"/>
-          </w:tcPr>
-          <w:p>
-            <w:r>
-              <w:t>All tools, priority support, training options</w:t>
-            </w:r>
-          </w:p>
-        </w:tc>
-      </w:tr>
-    </w:tbl>
-    <w:p>
-      <w:pPr>
-        <w:pStyle w:val="Heading2"/>
-      </w:pPr>
-      <w:r>
-        <w:t>Activating Your License</w:t>
-      </w:r>
-    </w:p>
-    <w:p>
-      <w:r>
-        <w:t>1. Launch Rhino 8. The plugin loads automatically.</w:t>
-      </w:r>
-    </w:p>
-    <w:p>
-      <w:r>
-        <w:t>2. Type ActivateFIFShoeKit in the Rhino command line.</w:t>
-      </w:r>
-    </w:p>
-    <w:p>
-      <w:r>
-        <w:t>3. Enter your license key when prompted.</w:t>
-      </w:r>
-    </w:p>
-    <w:p>
-      <w:r>
-        <w:t>4. The plugin contacts the license server to validate your key.</w:t>
-      </w:r>
-    </w:p>
-    <w:p>
-      <w:r>
-        <w:t>5. On success, the license is cached locally for offline use.</w:t>
-      </w:r>
-    </w:p>
-    <w:p>
-      <w:pPr>
-        <w:pStyle w:val="Heading2"/>
-      </w:pPr>
-      <w:r>
-        <w:t>Deactivating Your License</w:t>
-      </w:r>
-    </w:p>
-    <w:p>
-      <w:r>
-        <w:t>To transfer your license to a different machine, type DeactivateFIFShoeKit in the command line and confirm with "YES". This frees the machine slot on the server.</w:t>
-      </w:r>
-    </w:p>
-    <w:p>
-      <w:pPr>
-        <w:pStyle w:val="Heading2"/>
-      </w:pPr>
-      <w:r>
-        <w:t>Offline Mode</w:t>
-      </w:r>
-    </w:p>
-    <w:p>
-      <w:r>
-        <w:t>Once activated, the plugin caches the license locally. If the license server is unreachable, the plugin falls back to the cached license. An internet connection is required for the initial activation.</w:t>
+        <w:t>4. License</w:t>
+      </w:r>
+    </w:p>
+    <w:p>
+      <w:r>
+        <w:t>Feet in Focus Shoe Kit is a free plugin. No license key or activation is required. All features are available immediately after installation.</w:t>
       </w:r>
     </w:p>
     <w:p>
@@ -3001,7 +2793,7 @@
     </w:p>
     <w:p>
       <w:r>
-        <w:t>Debug and diagnostic command. Reports plugin status including: whether the plugin is loaded, presence of Last/Insert/Bottom/Foot data, edition, license status, document name, and object/layer counts.</w:t>
+        <w:t>Debug and diagnostic command. Reports plugin status including: whether the plugin is loaded, presence of Last/Insert/Bottom/Foot data, document name, and object/layer counts.</w:t>
       </w:r>
     </w:p>
     <w:p>
@@ -3570,12 +3362,12 @@
         <w:pStyle w:val="Heading2"/>
       </w:pPr>
       <w:r>
-        <w:t>License activation fails</w:t>
-      </w:r>
-    </w:p>
-    <w:p>
-      <w:r>
-        <w:t>Check your internet connection. Verify the license key format (alphanumeric with dashes). If the server is unreachable, try again later. Contact support at ShoeLastMaker.com if the issue persists.</w:t>
+        <w:t>Commands not found</w:t>
+      </w:r>
+    </w:p>
+    <w:p>
+      <w:r>
+        <w:t>Type the exact command name (case-sensitive) in the Rhino command line. Verify the plugin loaded successfully by checking for "[Feet in Focus Shoe Kit]" messages in the command history. Run the Testing command for diagnostics.</w:t>
       </w:r>
     </w:p>
     <w:p>
@@ -3583,12 +3375,12 @@
         <w:pStyle w:val="Heading2"/>
       </w:pPr>
       <w:r>
-        <w:t>Commands not found</w:t>
-      </w:r>
-    </w:p>
-    <w:p>
-      <w:r>
-        <w:t>Type the exact command name (case-sensitive) in the Rhino command line. Verify the plugin loaded successfully by checking for "[Feet in Focus Shoe Kit]" messages in the command history. Run the Testing command for diagnostics.</w:t>
+        <w:t>Geometry creation fails</w:t>
+      </w:r>
+    </w:p>
+    <w:p>
+      <w:r>
+        <w:t>Ensure a last has been created or imported first. Most component commands require an active last. Check that the current document has the SLM layer hierarchy set up (run Establish if needed).</w:t>
       </w:r>
     </w:p>
     <w:p>
@@ -3596,12 +3388,12 @@
         <w:pStyle w:val="Heading2"/>
       </w:pPr>
       <w:r>
-        <w:t>Geometry creation fails</w:t>
-      </w:r>
-    </w:p>
-    <w:p>
-      <w:r>
-        <w:t>Ensure a last has been created or imported first. Most component commands require an active last. Check that the current document has the SLM layer hierarchy set up (run Establish if needed).</w:t>
+        <w:t>Grading produces incorrect results</w:t>
+      </w:r>
+    </w:p>
+    <w:p>
+      <w:r>
+        <w:t>Verify the size system setting matches your intended system. Check that the current size is set correctly in document settings. The grading origin should be at the heel center for proper scaling.</w:t>
       </w:r>
     </w:p>
     <w:p>
@@ -3609,12 +3401,12 @@
         <w:pStyle w:val="Heading2"/>
       </w:pPr>
       <w:r>
-        <w:t>Grading produces incorrect results</w:t>
-      </w:r>
-    </w:p>
-    <w:p>
-      <w:r>
-        <w:t>Verify the size system setting matches your intended system. Check that the current size is set correctly in document settings. The grading origin should be at the heel center for proper scaling.</w:t>
+        <w:t>Import fails for foot scans</w:t>
+      </w:r>
+    </w:p>
+    <w:p>
+      <w:r>
+        <w:t>Ensure the file format is supported. For point clouds, verify the file uses comma, space, or tab-separated XYZ values. For mesh files, check that the file is not corrupted.</w:t>
       </w:r>
     </w:p>
     <w:p>
@@ -3622,19 +3414,6 @@
         <w:pStyle w:val="Heading2"/>
       </w:pPr>
       <w:r>
-        <w:t>Import fails for foot scans</w:t>
-      </w:r>
-    </w:p>
-    <w:p>
-      <w:r>
-        <w:t>Ensure the file format is supported. For point clouds, verify the file uses comma, space, or tab-separated XYZ values. For mesh files, check that the file is not corrupted.</w:t>
-      </w:r>
-    </w:p>
-    <w:p>
-      <w:pPr>
-        <w:pStyle w:val="Heading2"/>
-      </w:pPr>
-      <w:r>
         <w:t>Morph produces unexpected results</w:t>
       </w:r>
     </w:p>
@@ -3671,7 +3450,7 @@
         <w:pStyle w:val="ListBullet"/>
       </w:pPr>
       <w:r>
-        <w:t>A valid license key is required, purchasable at Feet in Focus Shoe Kit.com.</w:t>
+        <w:t>This is a free plugin. No license key is required.</w:t>
       </w:r>
     </w:p>
     <w:p>
@@ -3679,7 +3458,7 @@
         <w:pStyle w:val="ListBullet"/>
       </w:pPr>
       <w:r>
-        <w:t>Personal Edition may not be used for commercial purposes.</w:t>
+        <w:t>The software may not be copied, modified, or reverse-engineered.</w:t>
       </w:r>
     </w:p>
     <w:p>
@@ -3687,7 +3466,7 @@
         <w:pStyle w:val="ListBullet"/>
       </w:pPr>
       <w:r>
-        <w:t>Each license is tied to a single machine at a time.</w:t>
+        <w:t>Customer outputs (models, designs, products) are owned by the customer.</w:t>
       </w:r>
     </w:p>
     <w:p>
@@ -3695,7 +3474,7 @@
         <w:pStyle w:val="ListBullet"/>
       </w:pPr>
       <w:r>
-        <w:t>The software may not be copied, modified, or reverse-engineered.</w:t>
+        <w:t>The software is provided "as is" without warranty.</w:t>
       </w:r>
     </w:p>
     <w:p>
@@ -3703,31 +3482,7 @@
         <w:pStyle w:val="ListBullet"/>
       </w:pPr>
       <w:r>
-        <w:t>Customer outputs (models, designs, products) are owned by the customer.</w:t>
-      </w:r>
-    </w:p>
-    <w:p>
-      <w:pPr>
-        <w:pStyle w:val="ListBullet"/>
-      </w:pPr>
-      <w:r>
-        <w:t>The software is provided "as is" without warranty.</w:t>
-      </w:r>
-    </w:p>
-    <w:p>
-      <w:pPr>
-        <w:pStyle w:val="ListBullet"/>
-      </w:pPr>
-      <w:r>
         <w:t>The software does not provide medical or clinical advice.</w:t>
-      </w:r>
-    </w:p>
-    <w:p>
-      <w:pPr>
-        <w:pStyle w:val="ListBullet"/>
-      </w:pPr>
-      <w:r>
-        <w:t>An active internet connection is required to operate.</w:t>
       </w:r>
     </w:p>
     <w:p/>

</xml_diff>